<commit_message>
docs: fix frontend Vercel + JDBC env vars trong báo cáo 3
</commit_message>
<xml_diff>
--- a/docs/BaoCao_3_KetQuaDatDuoc.docx
+++ b/docs/BaoCao_3_KetQuaDatDuoc.docx
@@ -2673,7 +2673,7 @@
                 <w:sz w:val="22"/>
                 <w:szCs w:val="22"/>
               </w:rPr>
-              <w:t xml:space="preserve">Railway — Node 20 (Vite build → static serve)</w:t>
+              <w:t xml:space="preserve">Vercel (Vite build → static serve)</w:t>
             </w:r>
           </w:p>
         </w:tc>
@@ -2849,7 +2849,7 @@
           <w:sz w:val="24"/>
           <w:szCs w:val="24"/>
         </w:rPr>
-        <w:t xml:space="preserve">DB_PASSWORD: mật khẩu kết nối PostgreSQL (Railway env vars, không commit vào mã nguồn).</w:t>
+        <w:t xml:space="preserve">JDBC_DATABASE_URL / JDBC_DATABASE_USERNAME / JDBC_DATABASE_PASSWORD: thông tin kết nối PostgreSQL (Railway env vars, không commit vào mã nguồn).</w:t>
       </w:r>
     </w:p>
     <w:p>

</xml_diff>